<commit_message>
Record IJMR submission ID and status
</commit_message>
<xml_diff>
--- a/projects/india_patient_safety_surveillance/docs/manuscripts/target_journal_packages/ijmr_submission_candidate_round1/README.docx
+++ b/projects/india_patient_safety_surveillance/docs/manuscripts/target_journal_packages/ijmr_submission_candidate_round1/README.docx
@@ -2,7 +2,7 @@
 <file path=word/document.xml><?xml version="1.0" encoding="utf-8"?>
 <w:document xmlns:w="http://schemas.openxmlformats.org/wordprocessingml/2006/main" xmlns:m="http://schemas.openxmlformats.org/officeDocument/2006/math" xmlns:r="http://schemas.openxmlformats.org/officeDocument/2006/relationships" xmlns:o="urn:schemas-microsoft-com:office:office" xmlns:v="urn:schemas-microsoft-com:vml" xmlns:w10="urn:schemas-microsoft-com:office:word" xmlns:a="http://schemas.openxmlformats.org/drawingml/2006/main" xmlns:pic="http://schemas.openxmlformats.org/drawingml/2006/picture" xmlns:wp="http://schemas.openxmlformats.org/drawingml/2006/wordprocessingDrawing">
   <w:body>
-    <w:bookmarkStart w:id="12" w:name="ijmr-submission-candidate-round-1"/>
+    <w:bookmarkStart w:id="13" w:name="ijmr-submission-candidate-round-1"/>
     <w:p>
       <w:pPr>
         <w:pStyle w:val="Heading1"/>
@@ -168,7 +168,71 @@
       </w:r>
     </w:p>
     <w:bookmarkEnd w:id="11"/>
+    <w:bookmarkStart w:id="12" w:name="current-status"/>
+    <w:p>
+      <w:pPr>
+        <w:pStyle w:val="Heading2"/>
+      </w:pPr>
+      <w:r>
+        <w:t xml:space="preserve">Current status</w:t>
+      </w:r>
+    </w:p>
+    <w:p>
+      <w:pPr>
+        <w:pStyle w:val="Compact"/>
+        <w:numPr>
+          <w:ilvl w:val="0"/>
+          <w:numId w:val="1003"/>
+        </w:numPr>
+      </w:pPr>
+      <w:r>
+        <w:t xml:space="preserve">Submission completed</w:t>
+      </w:r>
+    </w:p>
+    <w:p>
+      <w:pPr>
+        <w:pStyle w:val="Compact"/>
+        <w:numPr>
+          <w:ilvl w:val="0"/>
+          <w:numId w:val="1003"/>
+        </w:numPr>
+      </w:pPr>
+      <w:r>
+        <w:t xml:space="preserve">Journal tracking ID:</w:t>
+      </w:r>
+      <w:r>
+        <w:t xml:space="preserve"> </w:t>
+      </w:r>
+      <w:r>
+        <w:rPr>
+          <w:rStyle w:val="VerbatimChar"/>
+        </w:rPr>
+        <w:t xml:space="preserve">IJMR_874_2026_a</w:t>
+      </w:r>
+    </w:p>
+    <w:p>
+      <w:pPr>
+        <w:pStyle w:val="Compact"/>
+        <w:numPr>
+          <w:ilvl w:val="0"/>
+          <w:numId w:val="1003"/>
+        </w:numPr>
+      </w:pPr>
+      <w:r>
+        <w:t xml:space="preserve">Submitted PDF snapshot:</w:t>
+      </w:r>
+      <w:r>
+        <w:t xml:space="preserve"> </w:t>
+      </w:r>
+      <w:r>
+        <w:rPr>
+          <w:rStyle w:val="VerbatimChar"/>
+        </w:rPr>
+        <w:t xml:space="preserve">IJMR_874_2026_a.pdf</w:t>
+      </w:r>
+    </w:p>
     <w:bookmarkEnd w:id="12"/>
+    <w:bookmarkEnd w:id="13"/>
     <w:sectPr>
       <w:footnotePr>
         <w:numRestart w:val="eachSect"/>
@@ -398,6 +462,36 @@
     </w:lvlOverride>
   </w:num>
   <w:num w:numId="1002">
+    <w:abstractNumId w:val="99411"/>
+    <w:lvlOverride w:ilvl="0">
+      <w:startOverride w:val="1"/>
+    </w:lvlOverride>
+    <w:lvlOverride w:ilvl="1">
+      <w:startOverride w:val="1"/>
+    </w:lvlOverride>
+    <w:lvlOverride w:ilvl="2">
+      <w:startOverride w:val="1"/>
+    </w:lvlOverride>
+    <w:lvlOverride w:ilvl="3">
+      <w:startOverride w:val="1"/>
+    </w:lvlOverride>
+    <w:lvlOverride w:ilvl="4">
+      <w:startOverride w:val="1"/>
+    </w:lvlOverride>
+    <w:lvlOverride w:ilvl="5">
+      <w:startOverride w:val="1"/>
+    </w:lvlOverride>
+    <w:lvlOverride w:ilvl="6">
+      <w:startOverride w:val="1"/>
+    </w:lvlOverride>
+    <w:lvlOverride w:ilvl="7">
+      <w:startOverride w:val="1"/>
+    </w:lvlOverride>
+    <w:lvlOverride w:ilvl="8">
+      <w:startOverride w:val="1"/>
+    </w:lvlOverride>
+  </w:num>
+  <w:num w:numId="1003">
     <w:abstractNumId w:val="99411"/>
     <w:lvlOverride w:ilvl="0">
       <w:startOverride w:val="1"/>

</xml_diff>